<commit_message>
Added menu + favourites + home page details
</commit_message>
<xml_diff>
--- a/CIS1054 - Project Overview.docx
+++ b/CIS1054 - Project Overview.docx
@@ -1,6 +1,6 @@
 
 <file path=word/document.xml><?xml version="1.0" encoding="utf-8"?>
-<w:document xmlns:wpc="http://schemas.microsoft.com/office/word/2010/wordprocessingCanvas" xmlns:cx="http://schemas.microsoft.com/office/drawing/2014/chartex" xmlns:cx1="http://schemas.microsoft.com/office/drawing/2015/9/8/chartex" xmlns:cx2="http://schemas.microsoft.com/office/drawing/2015/10/21/chartex" xmlns:cx3="http://schemas.microsoft.com/office/drawing/2016/5/9/chartex" xmlns:cx4="http://schemas.microsoft.com/office/drawing/2016/5/10/chartex" xmlns:cx5="http://schemas.microsoft.com/office/drawing/2016/5/11/chartex" xmlns:cx6="http://schemas.microsoft.com/office/drawing/2016/5/12/chartex" xmlns:cx7="http://schemas.microsoft.com/office/drawing/2016/5/13/chartex" xmlns:cx8="http://schemas.microsoft.com/office/drawing/2016/5/14/chartex" xmlns:mc="http://schemas.openxmlformats.org/markup-compatibility/2006" xmlns:aink="http://schemas.microsoft.com/office/drawing/2016/ink" xmlns:am3d="http://schemas.microsoft.com/office/drawing/2017/model3d" xmlns:o="urn:schemas-microsoft-com:office:office" xmlns:oel="http://schemas.microsoft.com/office/2019/extlst" xmlns:r="http://schemas.openxmlformats.org/officeDocument/2006/relationships" xmlns:m="http://schemas.openxmlformats.org/officeDocument/2006/math" xmlns:v="urn:schemas-microsoft-com:vml" xmlns:wp14="http://schemas.microsoft.com/office/word/2010/wordprocessingDrawing" xmlns:wp="http://schemas.openxmlformats.org/drawingml/2006/wordprocessingDrawing" xmlns:w10="urn:schemas-microsoft-com:office:word" xmlns:w="http://schemas.openxmlformats.org/wordprocessingml/2006/main" xmlns:w14="http://schemas.microsoft.com/office/word/2010/wordml" xmlns:w15="http://schemas.microsoft.com/office/word/2012/wordml" xmlns:w16cex="http://schemas.microsoft.com/office/word/2018/wordml/cex" xmlns:w16cid="http://schemas.microsoft.com/office/word/2016/wordml/cid" xmlns:w16="http://schemas.microsoft.com/office/word/2018/wordml" xmlns:w16du="http://schemas.microsoft.com/office/word/2023/wordml/word16du" xmlns:w16sdtdh="http://schemas.microsoft.com/office/word/2020/wordml/sdtdatahash" xmlns:w16sdtfl="http://schemas.microsoft.com/office/word/2024/wordml/sdtformatlock" xmlns:w16se="http://schemas.microsoft.com/office/word/2015/wordml/symex" xmlns:wpg="http://schemas.microsoft.com/office/word/2010/wordprocessingGroup" xmlns:wpi="http://schemas.microsoft.com/office/word/2010/wordprocessingInk" xmlns:wne="http://schemas.microsoft.com/office/word/2006/wordml" xmlns:wps="http://schemas.microsoft.com/office/word/2010/wordprocessingShape" mc:Ignorable="w14 w15 w16se w16cid w16 w16cex w16sdtdh w16sdtfl w16du wp14">
+<w:document xmlns:wpc="http://schemas.microsoft.com/office/word/2010/wordprocessingCanvas" xmlns:cx="http://schemas.microsoft.com/office/drawing/2014/chartex" xmlns:cx1="http://schemas.microsoft.com/office/drawing/2015/9/8/chartex" xmlns:cx2="http://schemas.microsoft.com/office/drawing/2015/10/21/chartex" xmlns:cx3="http://schemas.microsoft.com/office/drawing/2016/5/9/chartex" xmlns:cx4="http://schemas.microsoft.com/office/drawing/2016/5/10/chartex" xmlns:cx5="http://schemas.microsoft.com/office/drawing/2016/5/11/chartex" xmlns:cx6="http://schemas.microsoft.com/office/drawing/2016/5/12/chartex" xmlns:cx7="http://schemas.microsoft.com/office/drawing/2016/5/13/chartex" xmlns:cx8="http://schemas.microsoft.com/office/drawing/2016/5/14/chartex" xmlns:mc="http://schemas.openxmlformats.org/markup-compatibility/2006" xmlns:aink="http://schemas.microsoft.com/office/drawing/2016/ink" xmlns:am3d="http://schemas.microsoft.com/office/drawing/2017/model3d" xmlns:o="urn:schemas-microsoft-com:office:office" xmlns:r="http://schemas.openxmlformats.org/officeDocument/2006/relationships" xmlns:m="http://schemas.openxmlformats.org/officeDocument/2006/math" xmlns:v="urn:schemas-microsoft-com:vml" xmlns:wp14="http://schemas.microsoft.com/office/word/2010/wordprocessingDrawing" xmlns:wp="http://schemas.openxmlformats.org/drawingml/2006/wordprocessingDrawing" xmlns:w10="urn:schemas-microsoft-com:office:word" xmlns:w="http://schemas.openxmlformats.org/wordprocessingml/2006/main" xmlns:w14="http://schemas.microsoft.com/office/word/2010/wordml" xmlns:w15="http://schemas.microsoft.com/office/word/2012/wordml" xmlns:w16cex="http://schemas.microsoft.com/office/word/2018/wordml/cex" xmlns:w16cid="http://schemas.microsoft.com/office/word/2016/wordml/cid" xmlns:w16="http://schemas.microsoft.com/office/word/2018/wordml" xmlns:w16sdtdh="http://schemas.microsoft.com/office/word/2020/wordml/sdtdatahash" xmlns:w16se="http://schemas.microsoft.com/office/word/2015/wordml/symex" xmlns:wpg="http://schemas.microsoft.com/office/word/2010/wordprocessingGroup" xmlns:wpi="http://schemas.microsoft.com/office/word/2010/wordprocessingInk" xmlns:wne="http://schemas.microsoft.com/office/word/2006/wordml" xmlns:wps="http://schemas.microsoft.com/office/word/2010/wordprocessingShape" mc:Ignorable="w14 w15 w16se w16cid w16 w16cex w16sdtdh wp14">
   <w:body>
     <w:p>
       <w:r>
@@ -142,6 +142,10 @@
     <w:p>
       <w:pPr>
         <w:pStyle w:val="Heading1"/>
+        <w:numPr>
+          <w:ilvl w:val="0"/>
+          <w:numId w:val="1"/>
+        </w:numPr>
       </w:pPr>
       <w:r>
         <w:lastRenderedPageBreak/>
@@ -149,21 +153,33 @@
       </w:r>
     </w:p>
     <w:p>
+      <w:pPr>
+        <w:ind w:left="360"/>
+      </w:pPr>
       <w:r>
         <w:t>This part was done by all 3 members of the group on a single computer and committed as a whole in one go.</w:t>
       </w:r>
     </w:p>
     <w:p>
+      <w:pPr>
+        <w:ind w:left="360"/>
+      </w:pPr>
       <w:r>
         <w:t>For this part 10 questions were completed. An index page containing CSS code was also created to visually make seeing all the answers of each question a simpler and organised task.</w:t>
       </w:r>
     </w:p>
     <w:p>
+      <w:pPr>
+        <w:ind w:left="360"/>
+      </w:pPr>
       <w:r>
         <w:t>For both parts, XAMPP was used to host the website. The info of how this was setup can be found in the QuestionOne.md file in the CIS1054 Part 1 repository.</w:t>
       </w:r>
     </w:p>
     <w:p>
+      <w:pPr>
+        <w:ind w:left="360"/>
+      </w:pPr>
       <w:r>
         <w:t>Comments regarding how the php code works can be found in each page.</w:t>
       </w:r>
@@ -176,6 +192,10 @@
     <w:p>
       <w:pPr>
         <w:pStyle w:val="Heading1"/>
+        <w:numPr>
+          <w:ilvl w:val="0"/>
+          <w:numId w:val="1"/>
+        </w:numPr>
       </w:pPr>
       <w:r>
         <w:lastRenderedPageBreak/>
@@ -183,6 +203,9 @@
       </w:r>
     </w:p>
     <w:p>
+      <w:pPr>
+        <w:ind w:left="360"/>
+      </w:pPr>
       <w:r>
         <w:t xml:space="preserve">Part 2 covered the implementation of the restaurant website. Here </w:t>
       </w:r>
@@ -194,6 +217,9 @@
       </w:r>
     </w:p>
     <w:p>
+      <w:pPr>
+        <w:ind w:left="360"/>
+      </w:pPr>
       <w:r>
         <w:t xml:space="preserve">A html file that just contains the header and footer used in the website </w:t>
       </w:r>
@@ -207,12 +233,19 @@
     <w:p>
       <w:pPr>
         <w:pStyle w:val="Heading2"/>
-      </w:pPr>
-      <w:r>
-        <w:t>Contact us Page</w:t>
-      </w:r>
-    </w:p>
-    <w:p>
+        <w:ind w:left="360"/>
+      </w:pPr>
+      <w:r>
+        <w:rPr>
+          <w:lang w:val="en-GB"/>
+        </w:rPr>
+        <w:t>2.1. Contact us Page</w:t>
+      </w:r>
+    </w:p>
+    <w:p>
+      <w:pPr>
+        <w:ind w:left="360"/>
+      </w:pPr>
       <w:r>
         <w:t xml:space="preserve">A contact us page was created in order to help potential customers contact the restaurant. </w:t>
       </w:r>
@@ -230,6 +263,9 @@
       </w:r>
     </w:p>
     <w:p>
+      <w:pPr>
+        <w:ind w:left="360"/>
+      </w:pPr>
       <w:r>
         <w:t>Three forms were also created: One to book a table</w:t>
       </w:r>
@@ -253,6 +289,9 @@
       </w:r>
     </w:p>
     <w:p>
+      <w:pPr>
+        <w:ind w:left="360"/>
+      </w:pPr>
       <w:r>
         <w:t xml:space="preserve">The content of the forms would be sent to the person inputting the info inside the form and to the owner of the restaurant where both emails would be sent by the restaurant email. The </w:t>
       </w:r>
@@ -276,11 +315,17 @@
       </w:r>
     </w:p>
     <w:p>
+      <w:pPr>
+        <w:ind w:left="360"/>
+      </w:pPr>
       <w:r>
         <w:t xml:space="preserve">In order to test the email functionality of all three form php files, Mailtrap was used. To use Mailtrap an account was created. A new inbox was setup to which the SMTP details (including host, port, username and password) were provided by Mailtrap. All the Mailtrap SMTP details were then put into the form php files. After that code was written to configure the sender, recipients (being the owner and the client) and the content of the email which differed slightly between the two recipients. </w:t>
       </w:r>
     </w:p>
     <w:p>
+      <w:pPr>
+        <w:ind w:left="360"/>
+      </w:pPr>
       <w:r>
         <w:t xml:space="preserve">Before trying Mailtrap, </w:t>
       </w:r>
@@ -307,17 +352,206 @@
       </w:r>
     </w:p>
     <w:p>
+      <w:pPr>
+        <w:ind w:left="360"/>
+      </w:pPr>
       <w:r>
         <w:t>All three forms were then tested in the ContactUs page to ensure that the data inputted is being written to the CSV file relating to the form and that two emails were being sent (this was tested by checking the mailtrap inbox to see if two emails were sent (per form)).</w:t>
       </w:r>
     </w:p>
     <w:p>
+      <w:pPr>
+        <w:ind w:left="360"/>
+      </w:pPr>
       <w:r>
         <w:t xml:space="preserve">The details of how the code </w:t>
       </w:r>
       <w:r>
         <w:t>works were written as comments in the php files.</w:t>
       </w:r>
+    </w:p>
+    <w:p>
+      <w:pPr>
+        <w:pStyle w:val="Heading2"/>
+        <w:numPr>
+          <w:ilvl w:val="1"/>
+          <w:numId w:val="2"/>
+        </w:numPr>
+        <w:rPr>
+          <w:lang w:val="en-GB"/>
+        </w:rPr>
+      </w:pPr>
+      <w:r>
+        <w:rPr>
+          <w:lang w:val="en-GB"/>
+        </w:rPr>
+        <w:t>Menu</w:t>
+      </w:r>
+      <w:r>
+        <w:t xml:space="preserve"> Page</w:t>
+      </w:r>
+      <w:r>
+        <w:rPr>
+          <w:lang w:val="en-GB"/>
+        </w:rPr>
+        <w:t xml:space="preserve"> + favourites </w:t>
+      </w:r>
+    </w:p>
+    <w:p>
+      <w:pPr>
+        <w:ind w:left="360"/>
+        <w:rPr>
+          <w:lang w:val="en-GB"/>
+        </w:rPr>
+      </w:pPr>
+      <w:r>
+        <w:rPr>
+          <w:lang w:val="en-GB"/>
+        </w:rPr>
+        <w:t>The menu page was created for the client to be able to see the restaurant’s collection of food, sorted by cuisine, as well as allowing the client to mark their favourite dishes. The menu used a csv file to allow to load in the menu as well as easily manipulate it, containing the cuisine, dish type, name, description, price and image. The page would then load these dishes from the csv one by one using</w:t>
+      </w:r>
+      <w:r>
+        <w:rPr>
+          <w:lang w:val="en-GB"/>
+        </w:rPr>
+        <w:t xml:space="preserve"> a “foreach” loop.</w:t>
+      </w:r>
+    </w:p>
+    <w:p>
+      <w:pPr>
+        <w:ind w:left="360"/>
+        <w:rPr>
+          <w:lang w:val="en-GB"/>
+        </w:rPr>
+      </w:pPr>
+    </w:p>
+    <w:p>
+      <w:pPr>
+        <w:ind w:left="360"/>
+        <w:rPr>
+          <w:lang w:val="en-GB"/>
+        </w:rPr>
+      </w:pPr>
+      <w:r>
+        <w:rPr>
+          <w:lang w:val="en-GB"/>
+        </w:rPr>
+        <w:t xml:space="preserve">Then for favourites, it would use blanked out hearts near each dish, allowing users, per session to favourite certain dishes and then save it on a separate page. There was an error earlier on where whenever someone would favourite a page, it would send the user to the top of the page, using AJAX it now successfully stays at the same level whenever you favourite a dish. </w:t>
+      </w:r>
+    </w:p>
+    <w:p>
+      <w:pPr>
+        <w:ind w:left="360"/>
+        <w:rPr>
+          <w:lang w:val="en-GB"/>
+        </w:rPr>
+      </w:pPr>
+      <w:r>
+        <w:rPr>
+          <w:lang w:val="en-GB"/>
+        </w:rPr>
+        <w:t xml:space="preserve">Then, inside of the favourite page it displays the favourites the user marked in the menu page, as well as the option to be able to remove these items within the favourite page itself. At the bottom of the page, the user can then input their name and email address to be able send an email to them involving all of </w:t>
+      </w:r>
+      <w:proofErr w:type="gramStart"/>
+      <w:r>
+        <w:rPr>
+          <w:lang w:val="en-GB"/>
+        </w:rPr>
+        <w:t>their</w:t>
+      </w:r>
+      <w:proofErr w:type="gramEnd"/>
+      <w:r>
+        <w:rPr>
+          <w:lang w:val="en-GB"/>
+        </w:rPr>
+        <w:t xml:space="preserve"> favourited dishes using </w:t>
+      </w:r>
+      <w:proofErr w:type="spellStart"/>
+      <w:r>
+        <w:rPr>
+          <w:lang w:val="en-GB"/>
+        </w:rPr>
+        <w:t>M</w:t>
+      </w:r>
+      <w:r>
+        <w:rPr>
+          <w:lang w:val="en-GB"/>
+        </w:rPr>
+        <w:t>ailtrap</w:t>
+      </w:r>
+      <w:proofErr w:type="spellEnd"/>
+      <w:r>
+        <w:rPr>
+          <w:lang w:val="en-GB"/>
+        </w:rPr>
+        <w:t xml:space="preserve"> (which can be referred to from the earlier use in contact us). </w:t>
+      </w:r>
+    </w:p>
+    <w:p>
+      <w:pPr>
+        <w:ind w:left="360"/>
+        <w:rPr>
+          <w:lang w:val="en-GB"/>
+        </w:rPr>
+      </w:pPr>
+      <w:r>
+        <w:rPr>
+          <w:lang w:val="en-GB"/>
+        </w:rPr>
+        <w:t>There is also a second version of this page which happens whenever the user enters the favourite page without any favourites, displaying that “</w:t>
+      </w:r>
+      <w:r>
+        <w:rPr>
+          <w:lang w:val="en-GB"/>
+        </w:rPr>
+        <w:t>You have no favourite dishes selected.</w:t>
+      </w:r>
+      <w:r>
+        <w:rPr>
+          <w:lang w:val="en-GB"/>
+        </w:rPr>
+        <w:t>”</w:t>
+      </w:r>
+    </w:p>
+    <w:p>
+      <w:pPr>
+        <w:pStyle w:val="Heading2"/>
+        <w:numPr>
+          <w:ilvl w:val="1"/>
+          <w:numId w:val="2"/>
+        </w:numPr>
+        <w:rPr>
+          <w:lang w:val="en-GB"/>
+        </w:rPr>
+      </w:pPr>
+      <w:r>
+        <w:rPr>
+          <w:lang w:val="en-GB"/>
+        </w:rPr>
+        <w:t>Home Page</w:t>
+      </w:r>
+    </w:p>
+    <w:p>
+      <w:pPr>
+        <w:ind w:left="360"/>
+        <w:rPr>
+          <w:lang w:val="en-GB"/>
+        </w:rPr>
+      </w:pPr>
+      <w:r>
+        <w:rPr>
+          <w:lang w:val="en-GB"/>
+        </w:rPr>
+        <w:t>A very simple home page was made to define what the header and the footer would look like for every other page.</w:t>
+      </w:r>
+    </w:p>
+    <w:p>
+      <w:pPr>
+        <w:ind w:left="360"/>
+        <w:rPr>
+          <w:lang w:val="en-GB"/>
+        </w:rPr>
+      </w:pPr>
     </w:p>
     <w:sectPr>
       <w:pgSz w:w="11906" w:h="16838"/>
@@ -329,8 +563,253 @@
 </w:document>
 </file>
 
+<file path=word/numbering.xml><?xml version="1.0" encoding="utf-8"?>
+<w:numbering xmlns:wpc="http://schemas.microsoft.com/office/word/2010/wordprocessingCanvas" xmlns:cx="http://schemas.microsoft.com/office/drawing/2014/chartex" xmlns:cx1="http://schemas.microsoft.com/office/drawing/2015/9/8/chartex" xmlns:cx2="http://schemas.microsoft.com/office/drawing/2015/10/21/chartex" xmlns:cx3="http://schemas.microsoft.com/office/drawing/2016/5/9/chartex" xmlns:cx4="http://schemas.microsoft.com/office/drawing/2016/5/10/chartex" xmlns:cx5="http://schemas.microsoft.com/office/drawing/2016/5/11/chartex" xmlns:cx6="http://schemas.microsoft.com/office/drawing/2016/5/12/chartex" xmlns:cx7="http://schemas.microsoft.com/office/drawing/2016/5/13/chartex" xmlns:cx8="http://schemas.microsoft.com/office/drawing/2016/5/14/chartex" xmlns:mc="http://schemas.openxmlformats.org/markup-compatibility/2006" xmlns:aink="http://schemas.microsoft.com/office/drawing/2016/ink" xmlns:am3d="http://schemas.microsoft.com/office/drawing/2017/model3d" xmlns:o="urn:schemas-microsoft-com:office:office" xmlns:r="http://schemas.openxmlformats.org/officeDocument/2006/relationships" xmlns:m="http://schemas.openxmlformats.org/officeDocument/2006/math" xmlns:v="urn:schemas-microsoft-com:vml" xmlns:wp14="http://schemas.microsoft.com/office/word/2010/wordprocessingDrawing" xmlns:wp="http://schemas.openxmlformats.org/drawingml/2006/wordprocessingDrawing" xmlns:w10="urn:schemas-microsoft-com:office:word" xmlns:w="http://schemas.openxmlformats.org/wordprocessingml/2006/main" xmlns:w14="http://schemas.microsoft.com/office/word/2010/wordml" xmlns:w15="http://schemas.microsoft.com/office/word/2012/wordml" xmlns:w16cex="http://schemas.microsoft.com/office/word/2018/wordml/cex" xmlns:w16cid="http://schemas.microsoft.com/office/word/2016/wordml/cid" xmlns:w16="http://schemas.microsoft.com/office/word/2018/wordml" xmlns:w16sdtdh="http://schemas.microsoft.com/office/word/2020/wordml/sdtdatahash" xmlns:w16se="http://schemas.microsoft.com/office/word/2015/wordml/symex" xmlns:wpg="http://schemas.microsoft.com/office/word/2010/wordprocessingGroup" xmlns:wpi="http://schemas.microsoft.com/office/word/2010/wordprocessingInk" xmlns:wne="http://schemas.microsoft.com/office/word/2006/wordml" xmlns:wps="http://schemas.microsoft.com/office/word/2010/wordprocessingShape" mc:Ignorable="w14 w15 w16se w16cid w16 w16cex w16sdtdh wp14">
+  <w:abstractNum w:abstractNumId="0" w15:restartNumberingAfterBreak="0">
+    <w:nsid w:val="036A2A8B"/>
+    <w:multiLevelType w:val="multilevel"/>
+    <w:tmpl w:val="6F4AE8BA"/>
+    <w:lvl w:ilvl="0">
+      <w:start w:val="1"/>
+      <w:numFmt w:val="decimal"/>
+      <w:lvlText w:val="%1."/>
+      <w:lvlJc w:val="left"/>
+      <w:pPr>
+        <w:ind w:left="720" w:hanging="360"/>
+      </w:pPr>
+      <w:rPr>
+        <w:rFonts w:hint="default"/>
+      </w:rPr>
+    </w:lvl>
+    <w:lvl w:ilvl="1">
+      <w:start w:val="3"/>
+      <w:numFmt w:val="decimal"/>
+      <w:isLgl/>
+      <w:lvlText w:val="%1.%2."/>
+      <w:lvlJc w:val="left"/>
+      <w:pPr>
+        <w:ind w:left="1080" w:hanging="720"/>
+      </w:pPr>
+      <w:rPr>
+        <w:rFonts w:hint="default"/>
+      </w:rPr>
+    </w:lvl>
+    <w:lvl w:ilvl="2">
+      <w:start w:val="1"/>
+      <w:numFmt w:val="decimal"/>
+      <w:isLgl/>
+      <w:lvlText w:val="%1.%2.%3."/>
+      <w:lvlJc w:val="left"/>
+      <w:pPr>
+        <w:ind w:left="1080" w:hanging="720"/>
+      </w:pPr>
+      <w:rPr>
+        <w:rFonts w:hint="default"/>
+      </w:rPr>
+    </w:lvl>
+    <w:lvl w:ilvl="3">
+      <w:start w:val="1"/>
+      <w:numFmt w:val="decimal"/>
+      <w:isLgl/>
+      <w:lvlText w:val="%1.%2.%3.%4."/>
+      <w:lvlJc w:val="left"/>
+      <w:pPr>
+        <w:ind w:left="1440" w:hanging="1080"/>
+      </w:pPr>
+      <w:rPr>
+        <w:rFonts w:hint="default"/>
+      </w:rPr>
+    </w:lvl>
+    <w:lvl w:ilvl="4">
+      <w:start w:val="1"/>
+      <w:numFmt w:val="decimal"/>
+      <w:isLgl/>
+      <w:lvlText w:val="%1.%2.%3.%4.%5."/>
+      <w:lvlJc w:val="left"/>
+      <w:pPr>
+        <w:ind w:left="1800" w:hanging="1440"/>
+      </w:pPr>
+      <w:rPr>
+        <w:rFonts w:hint="default"/>
+      </w:rPr>
+    </w:lvl>
+    <w:lvl w:ilvl="5">
+      <w:start w:val="1"/>
+      <w:numFmt w:val="decimal"/>
+      <w:isLgl/>
+      <w:lvlText w:val="%1.%2.%3.%4.%5.%6."/>
+      <w:lvlJc w:val="left"/>
+      <w:pPr>
+        <w:ind w:left="1800" w:hanging="1440"/>
+      </w:pPr>
+      <w:rPr>
+        <w:rFonts w:hint="default"/>
+      </w:rPr>
+    </w:lvl>
+    <w:lvl w:ilvl="6">
+      <w:start w:val="1"/>
+      <w:numFmt w:val="decimal"/>
+      <w:isLgl/>
+      <w:lvlText w:val="%1.%2.%3.%4.%5.%6.%7."/>
+      <w:lvlJc w:val="left"/>
+      <w:pPr>
+        <w:ind w:left="2160" w:hanging="1800"/>
+      </w:pPr>
+      <w:rPr>
+        <w:rFonts w:hint="default"/>
+      </w:rPr>
+    </w:lvl>
+    <w:lvl w:ilvl="7">
+      <w:start w:val="1"/>
+      <w:numFmt w:val="decimal"/>
+      <w:isLgl/>
+      <w:lvlText w:val="%1.%2.%3.%4.%5.%6.%7.%8."/>
+      <w:lvlJc w:val="left"/>
+      <w:pPr>
+        <w:ind w:left="2520" w:hanging="2160"/>
+      </w:pPr>
+      <w:rPr>
+        <w:rFonts w:hint="default"/>
+      </w:rPr>
+    </w:lvl>
+    <w:lvl w:ilvl="8">
+      <w:start w:val="1"/>
+      <w:numFmt w:val="decimal"/>
+      <w:isLgl/>
+      <w:lvlText w:val="%1.%2.%3.%4.%5.%6.%7.%8.%9."/>
+      <w:lvlJc w:val="left"/>
+      <w:pPr>
+        <w:ind w:left="2520" w:hanging="2160"/>
+      </w:pPr>
+      <w:rPr>
+        <w:rFonts w:hint="default"/>
+      </w:rPr>
+    </w:lvl>
+  </w:abstractNum>
+  <w:abstractNum w:abstractNumId="1" w15:restartNumberingAfterBreak="0">
+    <w:nsid w:val="0FF56CA5"/>
+    <w:multiLevelType w:val="multilevel"/>
+    <w:tmpl w:val="6D76AA42"/>
+    <w:lvl w:ilvl="0">
+      <w:start w:val="2"/>
+      <w:numFmt w:val="decimal"/>
+      <w:lvlText w:val="%1."/>
+      <w:lvlJc w:val="left"/>
+      <w:pPr>
+        <w:ind w:left="480" w:hanging="480"/>
+      </w:pPr>
+      <w:rPr>
+        <w:rFonts w:hint="default"/>
+      </w:rPr>
+    </w:lvl>
+    <w:lvl w:ilvl="1">
+      <w:start w:val="2"/>
+      <w:numFmt w:val="decimal"/>
+      <w:lvlText w:val="%1.%2."/>
+      <w:lvlJc w:val="left"/>
+      <w:pPr>
+        <w:ind w:left="1080" w:hanging="720"/>
+      </w:pPr>
+      <w:rPr>
+        <w:rFonts w:hint="default"/>
+      </w:rPr>
+    </w:lvl>
+    <w:lvl w:ilvl="2">
+      <w:start w:val="1"/>
+      <w:numFmt w:val="decimal"/>
+      <w:lvlText w:val="%1.%2.%3."/>
+      <w:lvlJc w:val="left"/>
+      <w:pPr>
+        <w:ind w:left="1440" w:hanging="720"/>
+      </w:pPr>
+      <w:rPr>
+        <w:rFonts w:hint="default"/>
+      </w:rPr>
+    </w:lvl>
+    <w:lvl w:ilvl="3">
+      <w:start w:val="1"/>
+      <w:numFmt w:val="decimal"/>
+      <w:lvlText w:val="%1.%2.%3.%4."/>
+      <w:lvlJc w:val="left"/>
+      <w:pPr>
+        <w:ind w:left="2160" w:hanging="1080"/>
+      </w:pPr>
+      <w:rPr>
+        <w:rFonts w:hint="default"/>
+      </w:rPr>
+    </w:lvl>
+    <w:lvl w:ilvl="4">
+      <w:start w:val="1"/>
+      <w:numFmt w:val="decimal"/>
+      <w:lvlText w:val="%1.%2.%3.%4.%5."/>
+      <w:lvlJc w:val="left"/>
+      <w:pPr>
+        <w:ind w:left="2880" w:hanging="1440"/>
+      </w:pPr>
+      <w:rPr>
+        <w:rFonts w:hint="default"/>
+      </w:rPr>
+    </w:lvl>
+    <w:lvl w:ilvl="5">
+      <w:start w:val="1"/>
+      <w:numFmt w:val="decimal"/>
+      <w:lvlText w:val="%1.%2.%3.%4.%5.%6."/>
+      <w:lvlJc w:val="left"/>
+      <w:pPr>
+        <w:ind w:left="3240" w:hanging="1440"/>
+      </w:pPr>
+      <w:rPr>
+        <w:rFonts w:hint="default"/>
+      </w:rPr>
+    </w:lvl>
+    <w:lvl w:ilvl="6">
+      <w:start w:val="1"/>
+      <w:numFmt w:val="decimal"/>
+      <w:lvlText w:val="%1.%2.%3.%4.%5.%6.%7."/>
+      <w:lvlJc w:val="left"/>
+      <w:pPr>
+        <w:ind w:left="3960" w:hanging="1800"/>
+      </w:pPr>
+      <w:rPr>
+        <w:rFonts w:hint="default"/>
+      </w:rPr>
+    </w:lvl>
+    <w:lvl w:ilvl="7">
+      <w:start w:val="1"/>
+      <w:numFmt w:val="decimal"/>
+      <w:lvlText w:val="%1.%2.%3.%4.%5.%6.%7.%8."/>
+      <w:lvlJc w:val="left"/>
+      <w:pPr>
+        <w:ind w:left="4680" w:hanging="2160"/>
+      </w:pPr>
+      <w:rPr>
+        <w:rFonts w:hint="default"/>
+      </w:rPr>
+    </w:lvl>
+    <w:lvl w:ilvl="8">
+      <w:start w:val="1"/>
+      <w:numFmt w:val="decimal"/>
+      <w:lvlText w:val="%1.%2.%3.%4.%5.%6.%7.%8.%9."/>
+      <w:lvlJc w:val="left"/>
+      <w:pPr>
+        <w:ind w:left="5040" w:hanging="2160"/>
+      </w:pPr>
+      <w:rPr>
+        <w:rFonts w:hint="default"/>
+      </w:rPr>
+    </w:lvl>
+  </w:abstractNum>
+  <w:num w:numId="1">
+    <w:abstractNumId w:val="0"/>
+  </w:num>
+  <w:num w:numId="2">
+    <w:abstractNumId w:val="1"/>
+  </w:num>
+</w:numbering>
+</file>
+
 <file path=word/styles.xml><?xml version="1.0" encoding="utf-8"?>
-<w:styles xmlns:mc="http://schemas.openxmlformats.org/markup-compatibility/2006" xmlns:r="http://schemas.openxmlformats.org/officeDocument/2006/relationships" xmlns:w="http://schemas.openxmlformats.org/wordprocessingml/2006/main" xmlns:w14="http://schemas.microsoft.com/office/word/2010/wordml" xmlns:w15="http://schemas.microsoft.com/office/word/2012/wordml" xmlns:w16cex="http://schemas.microsoft.com/office/word/2018/wordml/cex" xmlns:w16cid="http://schemas.microsoft.com/office/word/2016/wordml/cid" xmlns:w16="http://schemas.microsoft.com/office/word/2018/wordml" xmlns:w16du="http://schemas.microsoft.com/office/word/2023/wordml/word16du" xmlns:w16sdtdh="http://schemas.microsoft.com/office/word/2020/wordml/sdtdatahash" xmlns:w16sdtfl="http://schemas.microsoft.com/office/word/2024/wordml/sdtformatlock" xmlns:w16se="http://schemas.microsoft.com/office/word/2015/wordml/symex" mc:Ignorable="w14 w15 w16se w16cid w16 w16cex w16sdtdh w16sdtfl w16du">
+<w:styles xmlns:mc="http://schemas.openxmlformats.org/markup-compatibility/2006" xmlns:r="http://schemas.openxmlformats.org/officeDocument/2006/relationships" xmlns:w="http://schemas.openxmlformats.org/wordprocessingml/2006/main" xmlns:w14="http://schemas.microsoft.com/office/word/2010/wordml" xmlns:w15="http://schemas.microsoft.com/office/word/2012/wordml" xmlns:w16cex="http://schemas.microsoft.com/office/word/2018/wordml/cex" xmlns:w16cid="http://schemas.microsoft.com/office/word/2016/wordml/cid" xmlns:w16="http://schemas.microsoft.com/office/word/2018/wordml" xmlns:w16sdtdh="http://schemas.microsoft.com/office/word/2020/wordml/sdtdatahash" xmlns:w16se="http://schemas.microsoft.com/office/word/2015/wordml/symex" mc:Ignorable="w14 w15 w16se w16cid w16 w16cex w16sdtdh">
   <w:docDefaults>
     <w:rPrDefault>
       <w:rPr>
@@ -338,7 +817,7 @@
         <w:kern w:val="2"/>
         <w:sz w:val="22"/>
         <w:szCs w:val="22"/>
-        <w:lang w:val="en-MT" w:eastAsia="en-US" w:bidi="ar-SA"/>
+        <w:lang w:eastAsia="en-US" w:bidi="ar-SA"/>
         <w14:ligatures w14:val="standardContextual"/>
       </w:rPr>
     </w:rPrDefault>

</xml_diff>